<commit_message>
new notes about hdfs, object storage, docker
</commit_message>
<xml_diff>
--- a/docker/docker detials notes.docx
+++ b/docker/docker detials notes.docx
@@ -102,13 +102,7 @@
         <w:t xml:space="preserve">– A path to the </w:t>
       </w:r>
       <w:r>
-        <w:t>b</w:t>
-      </w:r>
-      <w:r>
-        <w:t>uild context directory</w:t>
-      </w:r>
-      <w:r>
-        <w:t>.</w:t>
+        <w:t>build context directory.</w:t>
       </w:r>
     </w:p>
     <w:p/>
@@ -153,6 +147,77 @@
     <w:p>
       <w:r>
         <w:t>To be more precise it starts a new bash session inside of a container and allocates a pseudo terminal which we can use from our computer’s terminal.</w:t>
+      </w:r>
+    </w:p>
+    <w:p>
+      <w:pPr>
+        <w:pStyle w:val="Heading1"/>
+      </w:pPr>
+      <w:r>
+        <w:t>Docker user group</w:t>
+      </w:r>
+    </w:p>
+    <w:p>
+      <w:r>
+        <w:t>If we want a non root user to be able to run docker commands on Linux, then we need to add this user to a user group called ‘docker’.</w:t>
+      </w:r>
+    </w:p>
+    <w:p>
+      <w:pPr>
+        <w:pStyle w:val="Heading1"/>
+      </w:pPr>
+      <w:r>
+        <w:lastRenderedPageBreak/>
+        <w:t>Containerd</w:t>
+      </w:r>
+    </w:p>
+    <w:p>
+      <w:r>
+        <w:t>Docker uses containerd as a runtime for running containers. Docker is communicating with it.</w:t>
+      </w:r>
+    </w:p>
+    <w:p>
+      <w:pPr>
+        <w:pStyle w:val="Heading3"/>
+      </w:pPr>
+      <w:r>
+        <w:t>Containerd.sock</w:t>
+      </w:r>
+    </w:p>
+    <w:p>
+      <w:r>
+        <w:t>It is a file which is a Unix domain socket. It is containerd’s endpoint used by clients (like Kubernetes (kubelet) and other CLI tools) for communication with containerd.</w:t>
+      </w:r>
+    </w:p>
+    <w:p>
+      <w:r>
+        <w:t>Path of that file uniquely identifies that endpoint and is used by clients to connect to containerd (like an IP address).</w:t>
+      </w:r>
+    </w:p>
+    <w:p>
+      <w:pPr>
+        <w:pStyle w:val="Heading3"/>
+      </w:pPr>
+      <w:r>
+        <w:t>Crictl</w:t>
+      </w:r>
+    </w:p>
+    <w:p>
+      <w:r>
+        <w:t>It is a CLI tool used to interact with container runtimes like containerd.</w:t>
+      </w:r>
+    </w:p>
+    <w:p>
+      <w:pPr>
+        <w:pStyle w:val="Heading3"/>
+      </w:pPr>
+      <w:r>
+        <w:t>Crictl.yaml</w:t>
+      </w:r>
+    </w:p>
+    <w:p>
+      <w:r>
+        <w:t>It is a configuration file used by the circtl. Amoung the others it specifies a path to the socket (the .sock file) to use.</w:t>
       </w:r>
     </w:p>
     <w:p/>

</xml_diff>